<commit_message>
feat: add Model Details page with terminal-styled code block and enhanced hero workflow
</commit_message>
<xml_diff>
--- a/D065_D058_MidTerm Report.docx
+++ b/D065_D058_MidTerm Report.docx
@@ -1415,7 +1415,7 @@
           </mc:Choice>
           <mc:Fallback>
             <w:pict>
-              <v:shape w14:anchorId="1748F577" id="Graphic 13" o:spid="_x0000_s1026" style="position:absolute;margin-left:105.7pt;margin-top:17pt;width:57.6pt;height:.1pt;z-index:-15725568;visibility:visible;mso-wrap-style:square;mso-wrap-distance-left:0;mso-wrap-distance-top:0;mso-wrap-distance-right:0;mso-wrap-distance-bottom:0;mso-position-horizontal:absolute;mso-position-horizontal-relative:page;mso-position-vertical:absolute;mso-position-vertical-relative:text;v-text-anchor:top" coordsize="731520,1270" o:gfxdata="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" path="m,l731115,e" filled="f" strokeweight=".20694mm">
+              <v:shape w14:anchorId="6A278976" id="Graphic 13" o:spid="_x0000_s1026" style="position:absolute;margin-left:105.7pt;margin-top:17pt;width:57.6pt;height:.1pt;z-index:-15725568;visibility:visible;mso-wrap-style:square;mso-wrap-distance-left:0;mso-wrap-distance-top:0;mso-wrap-distance-right:0;mso-wrap-distance-bottom:0;mso-position-horizontal:absolute;mso-position-horizontal-relative:page;mso-position-vertical:absolute;mso-position-vertical-relative:text;v-text-anchor:top" coordsize="731520,1270" o:gfxdata="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" path="m,l731115,e" filled="f" strokeweight=".20694mm">
                 <v:path arrowok="t"/>
                 <w10:wrap type="topAndBottom" anchorx="page"/>
               </v:shape>
@@ -1496,7 +1496,7 @@
           </mc:Choice>
           <mc:Fallback>
             <w:pict>
-              <v:shape w14:anchorId="718EBFE4" id="Graphic 14" o:spid="_x0000_s1026" style="position:absolute;margin-left:376.1pt;margin-top:17pt;width:53.55pt;height:.1pt;z-index:-15725056;visibility:visible;mso-wrap-style:square;mso-wrap-distance-left:0;mso-wrap-distance-top:0;mso-wrap-distance-right:0;mso-wrap-distance-bottom:0;mso-position-horizontal:absolute;mso-position-horizontal-relative:page;mso-position-vertical:absolute;mso-position-vertical-relative:text;v-text-anchor:top" coordsize="680085,1270" o:gfxdata="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" path="m,l679732,e" filled="f" strokeweight=".20694mm">
+              <v:shape w14:anchorId="7C4C6A7B" id="Graphic 14" o:spid="_x0000_s1026" style="position:absolute;margin-left:376.1pt;margin-top:17pt;width:53.55pt;height:.1pt;z-index:-15725056;visibility:visible;mso-wrap-style:square;mso-wrap-distance-left:0;mso-wrap-distance-top:0;mso-wrap-distance-right:0;mso-wrap-distance-bottom:0;mso-position-horizontal:absolute;mso-position-horizontal-relative:page;mso-position-vertical:absolute;mso-position-vertical-relative:text;v-text-anchor:top" coordsize="680085,1270" o:gfxdata="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" path="m,l679732,e" filled="f" strokeweight=".20694mm">
                 <v:path arrowok="t"/>
                 <w10:wrap type="topAndBottom" anchorx="page"/>
               </v:shape>
@@ -1788,7 +1788,7 @@
           </mc:Choice>
           <mc:Fallback>
             <w:pict>
-              <v:group w14:anchorId="46F8A4BF" id="Group 15" o:spid="_x0000_s1026" style="width:77.5pt;height:.7pt;mso-position-horizontal-relative:char;mso-position-vertical-relative:line" coordsize="9842,88" o:gfxdata="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">
+              <v:group w14:anchorId="20B5A4F3" id="Group 15" o:spid="_x0000_s1026" style="width:77.5pt;height:.7pt;mso-position-horizontal-relative:char;mso-position-vertical-relative:line" coordsize="9842,88" o:gfxdata="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">
                 <v:shape id="Graphic 16" o:spid="_x0000_s1027" style="position:absolute;top:41;width:9842;height:13;visibility:visible;mso-wrap-style:square;v-text-anchor:top" coordsize="984250,1270" o:gfxdata="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" path="m,l983963,e" filled="f" strokeweight=".23019mm">
                   <v:path arrowok="t"/>
                 </v:shape>
@@ -2197,54 +2197,14 @@
         <w:pStyle w:val="BodyText"/>
         <w:spacing w:line="360" w:lineRule="auto"/>
         <w:rPr>
-          <w:sz w:val="24"/>
-          <w:szCs w:val="24"/>
-          <w:lang w:val="en-IN"/>
-        </w:rPr>
-      </w:pPr>
-      <w:r>
-        <w:rPr>
-          <w:sz w:val="24"/>
-          <w:szCs w:val="24"/>
-          <w:lang w:val="en-IN"/>
-        </w:rPr>
-        <w:t xml:space="preserve">The rapid adoption of Electric Vehicles (EVs) has led to a pressing need for a well-planned and efficient charging infrastructure. In major urban </w:t>
-      </w:r>
-      <w:proofErr w:type="spellStart"/>
-      <w:r>
-        <w:rPr>
-          <w:sz w:val="24"/>
-          <w:szCs w:val="24"/>
-          <w:lang w:val="en-IN"/>
-        </w:rPr>
-        <w:t>centers</w:t>
-      </w:r>
-      <w:proofErr w:type="spellEnd"/>
-      <w:r>
-        <w:rPr>
-          <w:sz w:val="24"/>
-          <w:szCs w:val="24"/>
-          <w:lang w:val="en-IN"/>
-        </w:rPr>
-        <w:t xml:space="preserve"> like Mumbai, identifying optimal charging station locations is crucial to meet increasing energy demand while minimizing congestion and grid stress. The project titled </w:t>
-      </w:r>
-      <w:r>
-        <w:rPr>
-          <w:i/>
-          <w:iCs/>
-          <w:sz w:val="24"/>
-          <w:szCs w:val="24"/>
-          <w:lang w:val="en-IN"/>
-        </w:rPr>
-        <w:t>“EVision – Smart Charging Forecasting &amp; Location Planner”</w:t>
-      </w:r>
-      <w:r>
-        <w:rPr>
-          <w:sz w:val="24"/>
-          <w:szCs w:val="24"/>
-          <w:lang w:val="en-IN"/>
-        </w:rPr>
-        <w:t xml:space="preserve"> aims to address this challenge by developing a data-driven system that forecasts EV charging demand and recommends suitable sites for establishing new charging stations.</w:t>
+          <w:rStyle w:val="Emphasis"/>
+        </w:rPr>
+      </w:pPr>
+      <w:r>
+        <w:rPr>
+          <w:rStyle w:val="Emphasis"/>
+        </w:rPr>
+        <w:t>The rapid adoption of Electric Vehicles (EVs) has led to a pressing need for a well-planned and efficient charging infrastructure. In major urban centers like Mumbai, identifying optimal charging station locations is crucial to meet increasing energy demand while minimizing congestion and grid stress. The project titled “EVision – Smart Charging Forecasting &amp; Location Planner” aims to address this challenge by developing a data-driven system that forecasts EV charging demand and recommends suitable sites for establishing new charging stations.</w:t>
       </w:r>
     </w:p>
     <w:p>
@@ -2252,108 +2212,38 @@
         <w:pStyle w:val="BodyText"/>
         <w:spacing w:line="360" w:lineRule="auto"/>
         <w:rPr>
-          <w:sz w:val="24"/>
-          <w:szCs w:val="24"/>
-          <w:lang w:val="en-IN"/>
-        </w:rPr>
-      </w:pPr>
-      <w:r>
-        <w:rPr>
-          <w:sz w:val="24"/>
-          <w:szCs w:val="24"/>
-          <w:lang w:val="en-IN"/>
-        </w:rPr>
-        <w:t xml:space="preserve">The proposed solution leverages </w:t>
-      </w:r>
-      <w:r>
-        <w:rPr>
-          <w:b/>
-          <w:bCs/>
-          <w:sz w:val="24"/>
-          <w:szCs w:val="24"/>
-          <w:lang w:val="en-IN"/>
-        </w:rPr>
-        <w:t>Machine Learning</w:t>
-      </w:r>
-      <w:r>
-        <w:rPr>
-          <w:sz w:val="24"/>
-          <w:szCs w:val="24"/>
-          <w:lang w:val="en-IN"/>
-        </w:rPr>
-        <w:t xml:space="preserve"> techniques and </w:t>
-      </w:r>
-      <w:r>
-        <w:rPr>
-          <w:b/>
-          <w:bCs/>
-          <w:sz w:val="24"/>
-          <w:szCs w:val="24"/>
-          <w:lang w:val="en-IN"/>
-        </w:rPr>
-        <w:t>predictive analytics</w:t>
-      </w:r>
-      <w:r>
-        <w:rPr>
-          <w:sz w:val="24"/>
-          <w:szCs w:val="24"/>
-          <w:lang w:val="en-IN"/>
-        </w:rPr>
-        <w:t xml:space="preserve"> to </w:t>
-      </w:r>
-      <w:proofErr w:type="spellStart"/>
-      <w:r>
-        <w:rPr>
-          <w:sz w:val="24"/>
-          <w:szCs w:val="24"/>
-          <w:lang w:val="en-IN"/>
-        </w:rPr>
-        <w:t>analyze</w:t>
-      </w:r>
-      <w:proofErr w:type="spellEnd"/>
-      <w:r>
-        <w:rPr>
-          <w:sz w:val="24"/>
-          <w:szCs w:val="24"/>
-          <w:lang w:val="en-IN"/>
-        </w:rPr>
-        <w:t xml:space="preserve"> real-world datasets comprising existing charging station usage, demographic data, and regional mobility patterns. A series of models—such as Ridge Regression, Random Forest, and </w:t>
-      </w:r>
-      <w:proofErr w:type="spellStart"/>
-      <w:r>
-        <w:rPr>
-          <w:sz w:val="24"/>
-          <w:szCs w:val="24"/>
-          <w:lang w:val="en-IN"/>
+          <w:rStyle w:val="Emphasis"/>
+        </w:rPr>
+      </w:pPr>
+      <w:r>
+        <w:rPr>
+          <w:rStyle w:val="Emphasis"/>
+        </w:rPr>
+        <w:t>The proposed solution leverages Machine Learning techniques and predictive analytics to analyze real-world datasets comprising existing charging station usage, demographic data, and regional mobility patterns. A series of models—such as Ridge Regression, Random Forest,</w:t>
+      </w:r>
+      <w:r>
+        <w:rPr>
+          <w:rStyle w:val="Emphasis"/>
+        </w:rPr>
+        <w:t xml:space="preserve"> </w:t>
+      </w:r>
+      <w:r>
+        <w:rPr>
+          <w:rStyle w:val="Emphasis"/>
         </w:rPr>
         <w:t>XGBoost</w:t>
       </w:r>
-      <w:proofErr w:type="spellEnd"/>
-      <w:r>
-        <w:rPr>
-          <w:sz w:val="24"/>
-          <w:szCs w:val="24"/>
-          <w:lang w:val="en-IN"/>
-        </w:rPr>
-        <w:t xml:space="preserve">—were implemented to predict future charging sessions and compute station suitability scores. Through rigorous preprocessing, feature engineering, and cross-validation, the system achieved a prediction accuracy of over </w:t>
-      </w:r>
-      <w:r>
-        <w:rPr>
-          <w:b/>
-          <w:bCs/>
-          <w:sz w:val="24"/>
-          <w:szCs w:val="24"/>
-          <w:lang w:val="en-IN"/>
-        </w:rPr>
-        <w:t>90%</w:t>
-      </w:r>
-      <w:r>
-        <w:rPr>
-          <w:sz w:val="24"/>
-          <w:szCs w:val="24"/>
-          <w:lang w:val="en-IN"/>
-        </w:rPr>
-        <w:t>, demonstrating its capability to reliably estimate charging requirements across different regions of Mumbai.</w:t>
+      <w:r>
+        <w:rPr>
+          <w:rStyle w:val="Emphasis"/>
+        </w:rPr>
+        <w:t xml:space="preserve">, Gradient Boosting, Linear Regression </w:t>
+      </w:r>
+      <w:r>
+        <w:rPr>
+          <w:rStyle w:val="Emphasis"/>
+        </w:rPr>
+        <w:t>—were implemented to predict future charging sessions and compute station suitability scores. Through rigorous preprocessing, feature engineering, and cross-validation, the system achieved a prediction accuracy of over 90%, demonstrating its capability to reliably estimate charging requirements across different regions of Mumbai.</w:t>
       </w:r>
     </w:p>
     <w:p>
@@ -2361,72 +2251,14 @@
         <w:pStyle w:val="BodyText"/>
         <w:spacing w:line="360" w:lineRule="auto"/>
         <w:rPr>
-          <w:sz w:val="24"/>
-          <w:szCs w:val="24"/>
-          <w:lang w:val="en-IN"/>
-        </w:rPr>
-      </w:pPr>
-      <w:r>
-        <w:rPr>
-          <w:sz w:val="24"/>
-          <w:szCs w:val="24"/>
-          <w:lang w:val="en-IN"/>
-        </w:rPr>
-        <w:t xml:space="preserve">To enhance accessibility and interpretability, the project integrates a </w:t>
-      </w:r>
-      <w:r>
-        <w:rPr>
-          <w:b/>
-          <w:bCs/>
-          <w:sz w:val="24"/>
-          <w:szCs w:val="24"/>
-          <w:lang w:val="en-IN"/>
-        </w:rPr>
-        <w:t>web-based dashboard</w:t>
-      </w:r>
-      <w:r>
-        <w:rPr>
-          <w:sz w:val="24"/>
-          <w:szCs w:val="24"/>
-          <w:lang w:val="en-IN"/>
-        </w:rPr>
-        <w:t xml:space="preserve"> built using </w:t>
-      </w:r>
-      <w:r>
-        <w:rPr>
-          <w:b/>
-          <w:bCs/>
-          <w:sz w:val="24"/>
-          <w:szCs w:val="24"/>
-          <w:lang w:val="en-IN"/>
-        </w:rPr>
-        <w:t>HTML, CSS, and JavaScript</w:t>
-      </w:r>
-      <w:r>
-        <w:rPr>
-          <w:sz w:val="24"/>
-          <w:szCs w:val="24"/>
-          <w:lang w:val="en-IN"/>
-        </w:rPr>
-        <w:t xml:space="preserve">, enabling interactive visualization of charging demand forecasts, existing station distributions, and recommended expansion sites. The frontend also includes data-driven charts, heatmaps, and an interactive map interface created using </w:t>
-      </w:r>
-      <w:r>
-        <w:rPr>
-          <w:b/>
-          <w:bCs/>
-          <w:sz w:val="24"/>
-          <w:szCs w:val="24"/>
-          <w:lang w:val="en-IN"/>
-        </w:rPr>
-        <w:t>Leaflet.js</w:t>
-      </w:r>
-      <w:r>
-        <w:rPr>
-          <w:sz w:val="24"/>
-          <w:szCs w:val="24"/>
-          <w:lang w:val="en-IN"/>
-        </w:rPr>
-        <w:t>, allowing users and policymakers to explore potential infrastructure gaps and opportunities in real time.</w:t>
+          <w:rStyle w:val="Emphasis"/>
+        </w:rPr>
+      </w:pPr>
+      <w:r>
+        <w:rPr>
+          <w:rStyle w:val="Emphasis"/>
+        </w:rPr>
+        <w:t>To enhance accessibility and interpretability, the project integrates a web-based dashboard built using HTML, CSS, and JavaScript, enabling interactive visualization of charging demand forecasts, existing station distributions, and recommended expansion sites. The frontend also includes data-driven charts, heatmaps, and an interactive map interface created using Leaflet.js, allowing users and policymakers to explore potential infrastructure gaps and opportunities in real time.</w:t>
       </w:r>
     </w:p>
     <w:p>
@@ -2434,54 +2266,14 @@
         <w:pStyle w:val="BodyText"/>
         <w:spacing w:line="360" w:lineRule="auto"/>
         <w:rPr>
-          <w:sz w:val="24"/>
-          <w:szCs w:val="24"/>
-          <w:lang w:val="en-IN"/>
-        </w:rPr>
-      </w:pPr>
-      <w:r>
-        <w:rPr>
-          <w:sz w:val="24"/>
-          <w:szCs w:val="24"/>
-          <w:lang w:val="en-IN"/>
-        </w:rPr>
-        <w:t xml:space="preserve">The system’s modular design ensures scalability and adaptability to other cities or regions with minimal retraining, as it can seamlessly incorporate additional parameters such as traffic data, weather influence, and power grid capacity. Future developments aim to integrate </w:t>
-      </w:r>
-      <w:r>
-        <w:rPr>
-          <w:b/>
-          <w:bCs/>
-          <w:sz w:val="24"/>
-          <w:szCs w:val="24"/>
-          <w:lang w:val="en-IN"/>
-        </w:rPr>
-        <w:t>real-time data pipelines</w:t>
-      </w:r>
-      <w:r>
-        <w:rPr>
-          <w:sz w:val="24"/>
-          <w:szCs w:val="24"/>
-          <w:lang w:val="en-IN"/>
-        </w:rPr>
-        <w:t xml:space="preserve"> and </w:t>
-      </w:r>
-      <w:r>
-        <w:rPr>
-          <w:b/>
-          <w:bCs/>
-          <w:sz w:val="24"/>
-          <w:szCs w:val="24"/>
-          <w:lang w:val="en-IN"/>
-        </w:rPr>
-        <w:t>IoT-based monitoring</w:t>
-      </w:r>
-      <w:r>
-        <w:rPr>
-          <w:sz w:val="24"/>
-          <w:szCs w:val="24"/>
-          <w:lang w:val="en-IN"/>
-        </w:rPr>
-        <w:t xml:space="preserve"> for dynamic forecasting and network optimization.</w:t>
+          <w:rStyle w:val="Emphasis"/>
+        </w:rPr>
+      </w:pPr>
+      <w:r>
+        <w:rPr>
+          <w:rStyle w:val="Emphasis"/>
+        </w:rPr>
+        <w:t>The system’s modular design ensures scalability and adaptability to other cities or regions with minimal retraining, as it can seamlessly incorporate additional parameters such as traffic data, weather influence, and power grid capacity. Future developments aim to integrate real-time data pipelines and IoT-based monitoring for dynamic forecasting and network optimization.</w:t>
       </w:r>
     </w:p>
     <w:p>
@@ -3269,18 +3061,16 @@
                 <w:szCs w:val="24"/>
                 <w:lang w:val="en-IN"/>
               </w:rPr>
-              <w:t xml:space="preserve">2.2 Power Consumption Forecasting and Economic </w:t>
-            </w:r>
-            <w:proofErr w:type="spellStart"/>
-            <w:r>
-              <w:rPr>
-                <w:sz w:val="24"/>
-                <w:szCs w:val="24"/>
-                <w:lang w:val="en-IN"/>
-              </w:rPr>
-              <w:t>Modeling</w:t>
-            </w:r>
-            <w:proofErr w:type="spellEnd"/>
+              <w:t>2.2 Power Consumption Forecasting and Economic Modeling</w:t>
+            </w:r>
+            <w:r>
+              <w:rPr>
+                <w:sz w:val="24"/>
+                <w:szCs w:val="24"/>
+                <w:lang w:val="en-IN"/>
+              </w:rPr>
+              <w:t xml:space="preserve"> </w:t>
+            </w:r>
           </w:p>
         </w:tc>
         <w:tc>
@@ -5019,25 +4809,7 @@
           <w:szCs w:val="24"/>
           <w:lang w:val="en-IN" w:eastAsia="en-IN"/>
         </w:rPr>
-        <w:t xml:space="preserve"> Implementing regression models (Ridge, Random Forest, and </w:t>
-      </w:r>
-      <w:proofErr w:type="spellStart"/>
-      <w:r>
-        <w:rPr>
-          <w:sz w:val="24"/>
-          <w:szCs w:val="24"/>
-          <w:lang w:val="en-IN" w:eastAsia="en-IN"/>
-        </w:rPr>
-        <w:t>XGBoost</w:t>
-      </w:r>
-      <w:proofErr w:type="spellEnd"/>
-      <w:r>
-        <w:rPr>
-          <w:sz w:val="24"/>
-          <w:szCs w:val="24"/>
-          <w:lang w:val="en-IN" w:eastAsia="en-IN"/>
-        </w:rPr>
-        <w:t>) for demand prediction.</w:t>
+        <w:t xml:space="preserve"> Implementing regression models (Ridge, Random Forest, and XGBoost) for demand prediction.</w:t>
       </w:r>
     </w:p>
     <w:p>
@@ -5782,7 +5554,25 @@
           <w:szCs w:val="24"/>
           <w:lang w:val="en-IN" w:eastAsia="en-IN"/>
         </w:rPr>
-        <w:t xml:space="preserve"> The modular design allows easy adaptation for other cities or datasets with minor retraining, making the solution both scalable and region-independent.</w:t>
+        <w:t xml:space="preserve"> The modular design allows easy adaptation for other cities or datasets with minor retraining, making the solution both scalable and </w:t>
+      </w:r>
+      <w:proofErr w:type="gramStart"/>
+      <w:r>
+        <w:rPr>
+          <w:sz w:val="24"/>
+          <w:szCs w:val="24"/>
+          <w:lang w:val="en-IN" w:eastAsia="en-IN"/>
+        </w:rPr>
+        <w:t>region-independent</w:t>
+      </w:r>
+      <w:proofErr w:type="gramEnd"/>
+      <w:r>
+        <w:rPr>
+          <w:sz w:val="24"/>
+          <w:szCs w:val="24"/>
+          <w:lang w:val="en-IN" w:eastAsia="en-IN"/>
+        </w:rPr>
+        <w:t>.</w:t>
       </w:r>
     </w:p>
     <w:p>
@@ -6441,37 +6231,33 @@
           <w:szCs w:val="24"/>
           <w:lang w:val="en-IN"/>
         </w:rPr>
-        <w:t>Extreme Gradient Boosting (</w:t>
-      </w:r>
-      <w:proofErr w:type="spellStart"/>
-      <w:r>
-        <w:rPr>
-          <w:b/>
-          <w:bCs/>
-          <w:sz w:val="24"/>
-          <w:szCs w:val="24"/>
-          <w:lang w:val="en-IN"/>
-        </w:rPr>
-        <w:t>XGBoost</w:t>
-      </w:r>
-      <w:proofErr w:type="spellEnd"/>
-      <w:r>
-        <w:rPr>
-          <w:b/>
-          <w:bCs/>
-          <w:sz w:val="24"/>
-          <w:szCs w:val="24"/>
-          <w:lang w:val="en-IN"/>
-        </w:rPr>
-        <w:t>)</w:t>
-      </w:r>
-      <w:r>
-        <w:rPr>
-          <w:sz w:val="24"/>
-          <w:szCs w:val="24"/>
-          <w:lang w:val="en-IN"/>
-        </w:rPr>
-        <w:t xml:space="preserve"> for socio-demographic feature analysis. The study demonstrated that spatially-aware models significantly improve prediction accuracy compared to purely temporal models. This approach influenced </w:t>
+        <w:t>Extreme Gradient Boosting (XGBoost)</w:t>
+      </w:r>
+      <w:r>
+        <w:rPr>
+          <w:sz w:val="24"/>
+          <w:szCs w:val="24"/>
+          <w:lang w:val="en-IN"/>
+        </w:rPr>
+        <w:t xml:space="preserve"> for socio-demographic feature analysis. The study demonstrated that </w:t>
+      </w:r>
+      <w:proofErr w:type="gramStart"/>
+      <w:r>
+        <w:rPr>
+          <w:sz w:val="24"/>
+          <w:szCs w:val="24"/>
+          <w:lang w:val="en-IN"/>
+        </w:rPr>
+        <w:t>spatially-aware</w:t>
+      </w:r>
+      <w:proofErr w:type="gramEnd"/>
+      <w:r>
+        <w:rPr>
+          <w:sz w:val="24"/>
+          <w:szCs w:val="24"/>
+          <w:lang w:val="en-IN"/>
+        </w:rPr>
+        <w:t xml:space="preserve"> models significantly improve prediction accuracy compared to purely temporal models. This approach influenced </w:t>
       </w:r>
       <w:proofErr w:type="spellStart"/>
       <w:r>
@@ -6641,20 +6427,8 @@
           <w:szCs w:val="28"/>
           <w:lang w:val="en-IN"/>
         </w:rPr>
-        <w:t xml:space="preserve">2.2 Power Consumption Forecasting and Economic </w:t>
-      </w:r>
-      <w:proofErr w:type="spellStart"/>
-      <w:r>
-        <w:rPr>
-          <w:b/>
-          <w:bCs/>
-          <w:sz w:val="28"/>
-          <w:szCs w:val="28"/>
-          <w:lang w:val="en-IN"/>
-        </w:rPr>
-        <w:t>Modeling</w:t>
-      </w:r>
-      <w:proofErr w:type="spellEnd"/>
+        <w:t>2.2 Power Consumption Forecasting and Economic Modeling</w:t>
+      </w:r>
     </w:p>
     <w:p>
       <w:pPr>
@@ -7796,25 +7570,7 @@
                 <w:szCs w:val="24"/>
                 <w:lang w:val="en-IN"/>
               </w:rPr>
-              <w:t>LSTM, CNN-</w:t>
-            </w:r>
-            <w:proofErr w:type="spellStart"/>
-            <w:r>
-              <w:rPr>
-                <w:sz w:val="24"/>
-                <w:szCs w:val="24"/>
-                <w:lang w:val="en-IN"/>
-              </w:rPr>
-              <w:t>XGBoost</w:t>
-            </w:r>
-            <w:proofErr w:type="spellEnd"/>
-            <w:r>
-              <w:rPr>
-                <w:sz w:val="24"/>
-                <w:szCs w:val="24"/>
-                <w:lang w:val="en-IN"/>
-              </w:rPr>
-              <w:t>, Global time series</w:t>
+              <w:t>LSTM, CNN-XGBoost, Global time series</w:t>
             </w:r>
           </w:p>
         </w:tc>
@@ -8128,7 +7884,25 @@
                 <w:szCs w:val="24"/>
                 <w:lang w:val="en-IN"/>
               </w:rPr>
-              <w:t>Integrated frameworks [1]–[6]</w:t>
+              <w:t>Integrated frameworks [1]</w:t>
+            </w:r>
+            <w:proofErr w:type="gramStart"/>
+            <w:r>
+              <w:rPr>
+                <w:sz w:val="24"/>
+                <w:szCs w:val="24"/>
+                <w:lang w:val="en-IN"/>
+              </w:rPr>
+              <w:t>–[</w:t>
+            </w:r>
+            <w:proofErr w:type="gramEnd"/>
+            <w:r>
+              <w:rPr>
+                <w:sz w:val="24"/>
+                <w:szCs w:val="24"/>
+                <w:lang w:val="en-IN"/>
+              </w:rPr>
+              <w:t>6]</w:t>
             </w:r>
           </w:p>
         </w:tc>
@@ -9971,7 +9745,25 @@
           <w:szCs w:val="24"/>
           <w:lang w:val="en-IN" w:eastAsia="en-IN"/>
         </w:rPr>
-        <w:t xml:space="preserve"> Helps private investors and EV operators identify profitable and high-utilization charging station sites.</w:t>
+        <w:t xml:space="preserve"> Helps private investors and EV operators identify profitable and </w:t>
+      </w:r>
+      <w:proofErr w:type="gramStart"/>
+      <w:r>
+        <w:rPr>
+          <w:sz w:val="24"/>
+          <w:szCs w:val="24"/>
+          <w:lang w:val="en-IN" w:eastAsia="en-IN"/>
+        </w:rPr>
+        <w:t>high-utilization</w:t>
+      </w:r>
+      <w:proofErr w:type="gramEnd"/>
+      <w:r>
+        <w:rPr>
+          <w:sz w:val="24"/>
+          <w:szCs w:val="24"/>
+          <w:lang w:val="en-IN" w:eastAsia="en-IN"/>
+        </w:rPr>
+        <w:t xml:space="preserve"> charging station sites.</w:t>
       </w:r>
     </w:p>
     <w:p>
@@ -10638,25 +10430,7 @@
           <w:szCs w:val="24"/>
           <w:lang w:val="en-IN"/>
         </w:rPr>
-        <w:t xml:space="preserve">, V., and Luo, D., “Large-Scale Forecasting of Electric Vehicle Charging Demand Using Global Time Series </w:t>
-      </w:r>
-      <w:proofErr w:type="spellStart"/>
-      <w:r>
-        <w:rPr>
-          <w:sz w:val="24"/>
-          <w:szCs w:val="24"/>
-          <w:lang w:val="en-IN"/>
-        </w:rPr>
-        <w:t>Modeling</w:t>
-      </w:r>
-      <w:proofErr w:type="spellEnd"/>
-      <w:r>
-        <w:rPr>
-          <w:sz w:val="24"/>
-          <w:szCs w:val="24"/>
-          <w:lang w:val="en-IN"/>
-        </w:rPr>
-        <w:t xml:space="preserve">,” </w:t>
+        <w:t xml:space="preserve">, V., and Luo, D., “Large-Scale Forecasting of Electric Vehicle Charging Demand Using Global Time Series Modeling,” </w:t>
       </w:r>
       <w:r>
         <w:rPr>
@@ -18887,6 +18661,7 @@
   <w:style w:type="character" w:default="1" w:styleId="DefaultParagraphFont">
     <w:name w:val="Default Paragraph Font"/>
     <w:uiPriority w:val="1"/>
+    <w:semiHidden/>
     <w:unhideWhenUsed/>
   </w:style>
   <w:style w:type="table" w:default="1" w:styleId="TableNormal">

</xml_diff>